<commit_message>
공통영어2 YBM(박) 2과 Further Reading: M·N 대조 의견 반영(Q01·Q04·Q05·Q06), 재확인 패킷
Co-Authored-By: Claude Opus 5.5 <noreply@anthropic.com>
Claude-Session: https://claude.ai/code/session_01E2Ji6oqzJY84iXPZFpFMCt
</commit_message>
<xml_diff>
--- a/결과물_공통2_2과/혼공독해교재_공통영어2_YBM(박)_2과FurtherReading_전체통합본.docx
+++ b/결과물_공통2_2과/혼공독해교재_공통영어2_YBM(박)_2과FurtherReading_전체통합본.docx
@@ -11058,7 +11058,7 @@
               <w:b w:val="0"/>
               <w:bCs w:val="0"/>
             </w:rPr>
-            <w:t xml:space="preserve">Without significant action, most people in the world could suffer from drought by 2050.</w:t>
+            <w:t xml:space="preserve">Without action on climate change, most people in the world could suffer from drought by 2050.</w:t>
           </w:r>
         </w:p>
         <w:p>
@@ -12579,7 +12579,7 @@
               <w:sz w:val="20"/>
               <w:szCs w:val="20"/>
             </w:rPr>
-            <w:t xml:space="preserve">[요약문] Hunger stones, which can be (A) ________ only when droughts lower the water in rivers, are believed to (B) ________ people to the hardships that droughts bring.</w:t>
+            <w:t xml:space="preserve">[요약문] Hunger stones, which can be (A) ________ only when droughts lower the water in rivers, are believed to (B) ________ people of the hardships that droughts bring.</w:t>
           </w:r>
         </w:p>
         <w:p>
@@ -12617,7 +12617,7 @@
               <w:b w:val="0"/>
               <w:bCs w:val="0"/>
             </w:rPr>
-            <w:t xml:space="preserve">hidden …… alert</w:t>
+            <w:t xml:space="preserve">hidden …… remind</w:t>
           </w:r>
         </w:p>
         <w:p>
@@ -12655,7 +12655,7 @@
               <w:b w:val="0"/>
               <w:bCs w:val="0"/>
             </w:rPr>
-            <w:t xml:space="preserve">seen …… alert</w:t>
+            <w:t xml:space="preserve">seen …… remind</w:t>
           </w:r>
         </w:p>
         <w:p>
@@ -12693,7 +12693,7 @@
               <w:b w:val="0"/>
               <w:bCs w:val="0"/>
             </w:rPr>
-            <w:t xml:space="preserve">seen …… blame</w:t>
+            <w:t xml:space="preserve">seen …… relieve</w:t>
           </w:r>
         </w:p>
         <w:p>
@@ -12731,7 +12731,7 @@
               <w:b w:val="0"/>
               <w:bCs w:val="0"/>
             </w:rPr>
-            <w:t xml:space="preserve">dry …… comfort</w:t>
+            <w:t xml:space="preserve">buried …… assure</w:t>
           </w:r>
         </w:p>
         <w:p>
@@ -12769,7 +12769,7 @@
               <w:b w:val="0"/>
               <w:bCs w:val="0"/>
             </w:rPr>
-            <w:t xml:space="preserve">hidden …… reward</w:t>
+            <w:t xml:space="preserve">hidden …… relieve</w:t>
           </w:r>
         </w:p>
         <w:p>
@@ -13114,7 +13114,7 @@
               <w:b w:val="0"/>
               <w:bCs w:val="0"/>
             </w:rPr>
-            <w:t xml:space="preserve">How to Find Stones Hidden Under Rivers</w:t>
+            <w:t xml:space="preserve">The Hunger Stone: A Rare Find in a Czech Town</w:t>
           </w:r>
         </w:p>
         <w:p>
@@ -13152,7 +13152,7 @@
               <w:b w:val="0"/>
               <w:bCs w:val="0"/>
             </w:rPr>
-            <w:t xml:space="preserve">Why Europe’s Rivers Are Getting Deeper</w:t>
+            <w:t xml:space="preserve">How Droughts Helped Europe Grow More Food</w:t>
           </w:r>
         </w:p>
         <w:p>
@@ -13190,7 +13190,7 @@
               <w:b w:val="0"/>
               <w:bCs w:val="0"/>
             </w:rPr>
-            <w:t xml:space="preserve">The Czech Town That Became Famous for Crying</w:t>
+            <w:t xml:space="preserve">Climate Change: Why Rivers Rise Every Summer</w:t>
           </w:r>
         </w:p>
         <w:p>
@@ -13228,7 +13228,7 @@
               <w:b w:val="0"/>
               <w:bCs w:val="0"/>
             </w:rPr>
-            <w:t xml:space="preserve">Farming Methods That Prevent Food Shortages</w:t>
+            <w:t xml:space="preserve">Ancient Stones That Predicted Floods in Europe</w:t>
           </w:r>
         </w:p>
         <w:p>
@@ -14453,17 +14453,17 @@
               <w:b w:val="0"/>
               <w:bCs w:val="0"/>
             </w:rPr>
-            <w:t xml:space="preserve">Without significant action, most people in the world could suffer from drought by 2050.   </w:t>
-          </w:r>
-          <w:r>
-            <w:rPr>
-              <w:color w:val="666666"/>
-              <w:sz w:val="17"/>
-              <w:szCs w:val="17"/>
-              <w:b w:val="0"/>
-              <w:bCs w:val="0"/>
-            </w:rPr>
-            <w:t xml:space="preserve">(상당한 조치가 없으면 2050년까지 세계 대부분의 사람들이 가뭄으로 고통받을 수 있다.)</w:t>
+            <w:t xml:space="preserve">Without action on climate change, most people in the world could suffer from drought by 2050.   </w:t>
+          </w:r>
+          <w:r>
+            <w:rPr>
+              <w:color w:val="666666"/>
+              <w:sz w:val="17"/>
+              <w:szCs w:val="17"/>
+              <w:b w:val="0"/>
+              <w:bCs w:val="0"/>
+            </w:rPr>
+            <w:t xml:space="preserve">(기후 변화에 대한 조치가 없으면 2050년까지 세계 대부분의 사람들이 가뭄으로 고통받을 수 있다.)</w:t>
           </w:r>
         </w:p>
         <w:p>
@@ -14607,7 +14607,7 @@
               <w:color w:val="666666"/>
               <w:sz w:val="17"/>
             </w:rPr>
-            <w:t xml:space="preserve">2050년까지 세계 인구의 75퍼센트가 가뭄의 영향으로 고통받을 수 있다고 했고, 상당한 조치가 취해지지 않는다면(unless significant action is taken)이라는 조건과도 일치한다.</w:t>
+            <w:t xml:space="preserve">2050년까지 세계 인구의 75퍼센트(4명 중 3명, 즉 대부분)가 가뭄의 영향으로 고통받을 수 있다고 했고, 기후 변화에 대처하는 상당한 조치가 취해지지 않는다면(unless significant action is taken to address climate change)이라는 조건과도 일치한다.</w:t>
           </w:r>
         </w:p>
         <w:p>
@@ -15781,7 +15781,7 @@
               <w:color w:val="000000"/>
               <w:sz w:val="18"/>
             </w:rPr>
-            <w:t xml:space="preserve">기아석은 가뭄이 들어 수위가 내려갈 때 보이게 되고(visible), 돌의 글은 가뭄이 가져오는 고난을 경고하고 대비하라고 촉구하는 것으로 여겨진다. 따라서 (A) seen(보이는), (B) alert(경고하다, 알리다)인 </w:t>
+            <w:t xml:space="preserve">기아석은 가뭄이 들어 수위가 내려갈 때 보이게 되고(visible), 돌의 글은 가뭄이 가져오는 고난을 경고하는(warn of) 것으로 여겨진다. 따라서 (A) seen(보이는), (B) remind(A에게 B를 일깨우다)인 </w:t>
           </w:r>
           <w:r>
             <w:rPr>
@@ -15849,17 +15849,17 @@
               <w:b w:val="0"/>
               <w:bCs w:val="0"/>
             </w:rPr>
-            <w:t xml:space="preserve">hidden …… alert   </w:t>
-          </w:r>
-          <w:r>
-            <w:rPr>
-              <w:color w:val="666666"/>
-              <w:sz w:val="17"/>
-              <w:szCs w:val="17"/>
-              <w:b w:val="0"/>
-              <w:bCs w:val="0"/>
-            </w:rPr>
-            <w:t xml:space="preserve">(숨겨진 …… 경고하다)</w:t>
+            <w:t xml:space="preserve">hidden …… remind   </w:t>
+          </w:r>
+          <w:r>
+            <w:rPr>
+              <w:color w:val="666666"/>
+              <w:sz w:val="17"/>
+              <w:szCs w:val="17"/>
+              <w:b w:val="0"/>
+              <w:bCs w:val="0"/>
+            </w:rPr>
+            <w:t xml:space="preserve">(숨겨진 …… 일깨우다)</w:t>
           </w:r>
         </w:p>
         <w:p>
@@ -15896,17 +15896,17 @@
               <w:b w:val="0"/>
               <w:bCs w:val="0"/>
             </w:rPr>
-            <w:t xml:space="preserve">seen …… alert   </w:t>
-          </w:r>
-          <w:r>
-            <w:rPr>
-              <w:color w:val="666666"/>
-              <w:sz w:val="17"/>
-              <w:szCs w:val="17"/>
-              <w:b w:val="0"/>
-              <w:bCs w:val="0"/>
-            </w:rPr>
-            <w:t xml:space="preserve">(보이는 …… 경고하다)</w:t>
+            <w:t xml:space="preserve">seen …… remind   </w:t>
+          </w:r>
+          <w:r>
+            <w:rPr>
+              <w:color w:val="666666"/>
+              <w:sz w:val="17"/>
+              <w:szCs w:val="17"/>
+              <w:b w:val="0"/>
+              <w:bCs w:val="0"/>
+            </w:rPr>
+            <w:t xml:space="preserve">(보이는 …… 일깨우다)</w:t>
           </w:r>
         </w:p>
         <w:p>
@@ -15943,17 +15943,17 @@
               <w:b w:val="0"/>
               <w:bCs w:val="0"/>
             </w:rPr>
-            <w:t xml:space="preserve">seen …… blame   </w:t>
-          </w:r>
-          <w:r>
-            <w:rPr>
-              <w:color w:val="666666"/>
-              <w:sz w:val="17"/>
-              <w:szCs w:val="17"/>
-              <w:b w:val="0"/>
-              <w:bCs w:val="0"/>
-            </w:rPr>
-            <w:t xml:space="preserve">(보이는 …… 탓하다)</w:t>
+            <w:t xml:space="preserve">seen …… relieve   </w:t>
+          </w:r>
+          <w:r>
+            <w:rPr>
+              <w:color w:val="666666"/>
+              <w:sz w:val="17"/>
+              <w:szCs w:val="17"/>
+              <w:b w:val="0"/>
+              <w:bCs w:val="0"/>
+            </w:rPr>
+            <w:t xml:space="preserve">(보이는 …… 덜어 주다)</w:t>
           </w:r>
         </w:p>
         <w:p>
@@ -15990,17 +15990,17 @@
               <w:b w:val="0"/>
               <w:bCs w:val="0"/>
             </w:rPr>
-            <w:t xml:space="preserve">dry …… comfort   </w:t>
-          </w:r>
-          <w:r>
-            <w:rPr>
-              <w:color w:val="666666"/>
-              <w:sz w:val="17"/>
-              <w:szCs w:val="17"/>
-              <w:b w:val="0"/>
-              <w:bCs w:val="0"/>
-            </w:rPr>
-            <w:t xml:space="preserve">(마른 …… 위로하다)</w:t>
+            <w:t xml:space="preserve">buried …… assure   </w:t>
+          </w:r>
+          <w:r>
+            <w:rPr>
+              <w:color w:val="666666"/>
+              <w:sz w:val="17"/>
+              <w:szCs w:val="17"/>
+              <w:b w:val="0"/>
+              <w:bCs w:val="0"/>
+            </w:rPr>
+            <w:t xml:space="preserve">(묻힌 …… 확신시키다)</w:t>
           </w:r>
         </w:p>
         <w:p>
@@ -16037,17 +16037,17 @@
               <w:b w:val="0"/>
               <w:bCs w:val="0"/>
             </w:rPr>
-            <w:t xml:space="preserve">hidden …… reward   </w:t>
-          </w:r>
-          <w:r>
-            <w:rPr>
-              <w:color w:val="666666"/>
-              <w:sz w:val="17"/>
-              <w:szCs w:val="17"/>
-              <w:b w:val="0"/>
-              <w:bCs w:val="0"/>
-            </w:rPr>
-            <w:t xml:space="preserve">(숨겨진 …… 보상하다)</w:t>
+            <w:t xml:space="preserve">hidden …… relieve   </w:t>
+          </w:r>
+          <w:r>
+            <w:rPr>
+              <w:color w:val="666666"/>
+              <w:sz w:val="17"/>
+              <w:szCs w:val="17"/>
+              <w:b w:val="0"/>
+              <w:bCs w:val="0"/>
+            </w:rPr>
+            <w:t xml:space="preserve">(숨겨진 …… 덜어 주다)</w:t>
           </w:r>
         </w:p>
         <w:p>
@@ -16095,7 +16095,7 @@
               <w:color w:val="666666"/>
               <w:sz w:val="17"/>
             </w:rPr>
-            <w:t xml:space="preserve">(B) alert는 맞지만, 기아석은 가뭄 때 숨겨지는 것이 아니라 드러나므로(become visible) (A) hidden은 반대다.</w:t>
+            <w:t xml:space="preserve">(B) remind는 맞지만, 기아석은 가뭄 때 숨겨지는 것이 아니라 드러나므로(become visible) (A) hidden은 반대다.</w:t>
           </w:r>
         </w:p>
         <w:p>
@@ -16127,7 +16127,7 @@
               <w:color w:val="666666"/>
               <w:sz w:val="17"/>
             </w:rPr>
-            <w:t xml:space="preserve">(A) seen은 맞지만, 돌의 글은 사람들을 탓하는 것이 아니라 고난을 경고한다.</w:t>
+            <w:t xml:space="preserve">(A) seen은 맞지만, 돌의 글은 사람들의 고난을 덜어 주는(relieve A of B) 것이 아니라 고난을 경고한다.</w:t>
           </w:r>
         </w:p>
         <w:p>
@@ -16159,7 +16159,7 @@
               <w:color w:val="666666"/>
               <w:sz w:val="17"/>
             </w:rPr>
-            <w:t xml:space="preserve">돌이 마르는지는 요점이 아니고, 돌의 글은 사람들을 위로하는 것이 아니라 대비하라고 촉구한다.</w:t>
+            <w:t xml:space="preserve">돌의 글은 고난이 오지 않는다고 안심시키거나 확신시키는(assure A of B) 것이 아니라 고난을 경고한다. 또 기아석은 가뭄 때 물 밖으로 드러나므로 (A) buried(묻힌)도 맞지 않다.</w:t>
           </w:r>
         </w:p>
         <w:p>
@@ -16191,7 +16191,7 @@
               <w:color w:val="666666"/>
               <w:sz w:val="17"/>
             </w:rPr>
-            <w:t xml:space="preserve">기아석은 가뭄 때 드러나며, 사람들에게 보상하는 내용은 없다.</w:t>
+            <w:t xml:space="preserve">기아석은 가뭄 때 드러나며(hidden은 반대), 돌의 글은 고난을 덜어 주는 것이 아니라 경고한다.</w:t>
           </w:r>
         </w:p>
         <w:p>
@@ -16246,7 +16246,7 @@
               <w:color w:val="000000"/>
               <w:sz w:val="18"/>
             </w:rPr>
-            <w:t xml:space="preserve">The words on the hunger stones are believed to warn of these hardships and to urge people to be prepared.</w:t>
+            <w:t xml:space="preserve">The words on the hunger stones are believed to warn of these hardships and to urge people to be prepared. / The United Nations has predicted that by 2050, 75 percent of the global population could suffer from the effects of drought unless significant action is taken to address climate change.</w:t>
           </w:r>
         </w:p>
         <w:p>
@@ -16339,7 +16339,7 @@
               <w:b w:val="0"/>
               <w:bCs w:val="0"/>
             </w:rPr>
-            <w:t xml:space="preserve">(기아석: 더 건조한 미래를 위한 옛 경고)</w:t>
+            <w:t xml:space="preserve">(기아석: 더 건조한 미래에 대한 옛 경고)</w:t>
           </w:r>
         </w:p>
         <w:p>
@@ -16376,17 +16376,17 @@
               <w:b w:val="0"/>
               <w:bCs w:val="0"/>
             </w:rPr>
-            <w:t xml:space="preserve">How to Find Stones Hidden Under Rivers   </w:t>
-          </w:r>
-          <w:r>
-            <w:rPr>
-              <w:color w:val="666666"/>
-              <w:sz w:val="17"/>
-              <w:szCs w:val="17"/>
-              <w:b w:val="0"/>
-              <w:bCs w:val="0"/>
-            </w:rPr>
-            <w:t xml:space="preserve">(강 아래 숨겨진 돌을 찾는 방법)</w:t>
+            <w:t xml:space="preserve">The Hunger Stone: A Rare Find in a Czech Town   </w:t>
+          </w:r>
+          <w:r>
+            <w:rPr>
+              <w:color w:val="666666"/>
+              <w:sz w:val="17"/>
+              <w:szCs w:val="17"/>
+              <w:b w:val="0"/>
+              <w:bCs w:val="0"/>
+            </w:rPr>
+            <w:t xml:space="preserve">(기아석: 체코 마을에서의 드문 발견)</w:t>
           </w:r>
         </w:p>
         <w:p>
@@ -16423,17 +16423,17 @@
               <w:b w:val="0"/>
               <w:bCs w:val="0"/>
             </w:rPr>
-            <w:t xml:space="preserve">Why Europe’s Rivers Are Getting Deeper   </w:t>
-          </w:r>
-          <w:r>
-            <w:rPr>
-              <w:color w:val="666666"/>
-              <w:sz w:val="17"/>
-              <w:szCs w:val="17"/>
-              <w:b w:val="0"/>
-              <w:bCs w:val="0"/>
-            </w:rPr>
-            <w:t xml:space="preserve">(유럽의 강들이 더 깊어지고 있는 이유)</w:t>
+            <w:t xml:space="preserve">How Droughts Helped Europe Grow More Food   </w:t>
+          </w:r>
+          <w:r>
+            <w:rPr>
+              <w:color w:val="666666"/>
+              <w:sz w:val="17"/>
+              <w:szCs w:val="17"/>
+              <w:b w:val="0"/>
+              <w:bCs w:val="0"/>
+            </w:rPr>
+            <w:t xml:space="preserve">(가뭄이 유럽의 식량 증산을 도운 방법)</w:t>
           </w:r>
         </w:p>
         <w:p>
@@ -16470,17 +16470,17 @@
               <w:b w:val="0"/>
               <w:bCs w:val="0"/>
             </w:rPr>
-            <w:t xml:space="preserve">The Czech Town That Became Famous for Crying   </w:t>
-          </w:r>
-          <w:r>
-            <w:rPr>
-              <w:color w:val="666666"/>
-              <w:sz w:val="17"/>
-              <w:szCs w:val="17"/>
-              <w:b w:val="0"/>
-              <w:bCs w:val="0"/>
-            </w:rPr>
-            <w:t xml:space="preserve">(울음으로 유명해진 체코 마을)</w:t>
+            <w:t xml:space="preserve">Climate Change: Why Rivers Rise Every Summer   </w:t>
+          </w:r>
+          <w:r>
+            <w:rPr>
+              <w:color w:val="666666"/>
+              <w:sz w:val="17"/>
+              <w:szCs w:val="17"/>
+              <w:b w:val="0"/>
+              <w:bCs w:val="0"/>
+            </w:rPr>
+            <w:t xml:space="preserve">(기후 변화: 강물이 매년 여름 불어나는 이유)</w:t>
           </w:r>
         </w:p>
         <w:p>
@@ -16517,17 +16517,17 @@
               <w:b w:val="0"/>
               <w:bCs w:val="0"/>
             </w:rPr>
-            <w:t xml:space="preserve">Farming Methods That Prevent Food Shortages   </w:t>
-          </w:r>
-          <w:r>
-            <w:rPr>
-              <w:color w:val="666666"/>
-              <w:sz w:val="17"/>
-              <w:szCs w:val="17"/>
-              <w:b w:val="0"/>
-              <w:bCs w:val="0"/>
-            </w:rPr>
-            <w:t xml:space="preserve">(식량 부족을 막는 농사 방법)</w:t>
+            <w:t xml:space="preserve">Ancient Stones That Predicted Floods in Europe   </w:t>
+          </w:r>
+          <w:r>
+            <w:rPr>
+              <w:color w:val="666666"/>
+              <w:sz w:val="17"/>
+              <w:szCs w:val="17"/>
+              <w:b w:val="0"/>
+              <w:bCs w:val="0"/>
+            </w:rPr>
+            <w:t xml:space="preserve">(유럽의 홍수를 예고한 옛 돌들)</w:t>
           </w:r>
         </w:p>
         <w:p>
@@ -16575,7 +16575,7 @@
               <w:color w:val="666666"/>
               <w:sz w:val="17"/>
             </w:rPr>
-            <w:t xml:space="preserve">돌을 찾는 방법은 다루지 않는다.</w:t>
+            <w:t xml:space="preserve">체코 마을에서의 발견은 글을 시작하는 사례일 뿐이고, 글은 기아석의 의미와 앞으로의 가뭄 경고까지 다룬다.</w:t>
           </w:r>
         </w:p>
         <w:p>
@@ -16607,7 +16607,7 @@
               <w:color w:val="666666"/>
               <w:sz w:val="17"/>
             </w:rPr>
-            <w:t xml:space="preserve">가뭄 때 수위가 내려간다(water levels retreat)고 했으므로 강이 깊어진다는 것은 반대다.</w:t>
+            <w:t xml:space="preserve">가뭄은 수확 감소와 식량 부족을 일으킨다고 했으므로 반대다.</w:t>
           </w:r>
         </w:p>
         <w:p>
@@ -16639,7 +16639,7 @@
               <w:color w:val="666666"/>
               <w:sz w:val="17"/>
             </w:rPr>
-            <w:t xml:space="preserve">체코 마을은 기아석이 발견된 장소로만 나오며, 마을이 유명해진 이야기가 아니다.</w:t>
+            <w:t xml:space="preserve">가뭄 때 수위가 내려간다(water levels retreat)고 했으므로 강물이 불어난다는 것은 반대다.</w:t>
           </w:r>
         </w:p>
         <w:p>
@@ -16671,7 +16671,7 @@
               <w:color w:val="666666"/>
               <w:sz w:val="17"/>
             </w:rPr>
-            <w:t xml:space="preserve">식량 부족은 가뭄의 결과로 언급될 뿐, 그것을 막는 농사 방법은 나오지 않는다.</w:t>
+            <w:t xml:space="preserve">기아석은 홍수가 아니라 가뭄 때 드러나 가뭄의 고난을 경고한다.</w:t>
           </w:r>
         </w:p>
         <w:p>
@@ -16726,7 +16726,7 @@
               <w:color w:val="000000"/>
               <w:sz w:val="18"/>
             </w:rPr>
-            <w:t xml:space="preserve">experts warn that the situation we face is not just a simple, occasional drought but a severe drought that could persist for decades.</w:t>
+            <w:t xml:space="preserve">experts warn that the situation we face is not just a simple, occasional drought but a severe drought that could cease for decades.</w:t>
           </w:r>
         </w:p>
         <w:p>
@@ -16741,7 +16741,7 @@
               <w:color w:val="000000"/>
               <w:sz w:val="18"/>
             </w:rPr>
-            <w:t xml:space="preserve">not just A but B 구조로 단순하고 이따금 있는 가뭄(A)이 아니라 더 심각한 상황(B)을 말한다. 기후 변화가 계속되는 것을 고려하면 그 심각한 가뭄은 수십 년 동안 지속될(persist) 수 있어야 문맥에 맞다. 따라서 </w:t>
+            <w:t xml:space="preserve">(원문 낱말: persist) not just A but B 구조로 단순하고 이따금 있는 가뭄(A)이 아니라 더 심각한 상황(B)을 말한다. 기후 변화가 계속되는 것을 고려하면 그 심각한 가뭄은 수십 년 동안 지속될(persist) 수 있어야 문맥에 맞다. 따라서 </w:t>
           </w:r>
           <w:r>
             <w:rPr>

</xml_diff>